<commit_message>
fix: enforce RTL direction and right alignment for TOC styles
</commit_message>
<xml_diff>
--- a/output/final/thesis_final_draft.docx
+++ b/output/final/thesis_final_draft.docx
@@ -730,8 +730,9 @@
     </w:p>
     <w:p>
       <w:pPr>
+        <w:pStyle w:val="TOC1"/>
         <w:bidi/>
-        <w:jc w:val="both"/>
+        <w:jc w:val="right"/>
         <w:spacing w:line="580" w:lineRule="exact"/>
       </w:pPr>
       <w:r>
@@ -739,194 +740,220 @@
           <w:rFonts w:ascii="B Nazanin" w:hAnsi="B Nazanin" w:cs="B Nazanin"/>
           <w:sz w:val="24"/>
           <w:szCs w:val="24"/>
+          <w:rtl/>
         </w:rPr>
         <w:t>فصل اول</w:t>
       </w:r>
     </w:p>
     <w:p>
       <w:pPr>
+        <w:pStyle w:val="TOC2"/>
         <w:bidi/>
-        <w:jc w:val="both"/>
+        <w:jc w:val="right"/>
         <w:spacing w:line="580" w:lineRule="exact"/>
       </w:pPr>
       <w:r>
         <w:rPr>
           <w:rFonts w:ascii="B Nazanin" w:hAnsi="B Nazanin" w:cs="B Nazanin"/>
-          <w:sz w:val="24"/>
-          <w:szCs w:val="24"/>
+          <w:sz w:val="22"/>
+          <w:szCs w:val="22"/>
+          <w:rtl/>
         </w:rPr>
         <w:t>۱-۱. مقدمه</w:t>
       </w:r>
     </w:p>
     <w:p>
       <w:pPr>
+        <w:pStyle w:val="TOC2"/>
         <w:bidi/>
-        <w:jc w:val="both"/>
+        <w:jc w:val="right"/>
         <w:spacing w:line="580" w:lineRule="exact"/>
       </w:pPr>
       <w:r>
         <w:rPr>
           <w:rFonts w:ascii="B Nazanin" w:hAnsi="B Nazanin" w:cs="B Nazanin"/>
-          <w:sz w:val="24"/>
-          <w:szCs w:val="24"/>
+          <w:sz w:val="22"/>
+          <w:szCs w:val="22"/>
+          <w:rtl/>
         </w:rPr>
         <w:t>۱-۲. بیان مسأله</w:t>
       </w:r>
     </w:p>
     <w:p>
       <w:pPr>
+        <w:pStyle w:val="TOC2"/>
         <w:bidi/>
-        <w:jc w:val="both"/>
+        <w:jc w:val="right"/>
         <w:spacing w:line="580" w:lineRule="exact"/>
       </w:pPr>
       <w:r>
         <w:rPr>
           <w:rFonts w:ascii="B Nazanin" w:hAnsi="B Nazanin" w:cs="B Nazanin"/>
-          <w:sz w:val="24"/>
-          <w:szCs w:val="24"/>
+          <w:sz w:val="22"/>
+          <w:szCs w:val="22"/>
+          <w:rtl/>
         </w:rPr>
         <w:t>۱-۳. اهمیت و ضرورت پژوهش</w:t>
       </w:r>
     </w:p>
     <w:p>
       <w:pPr>
+        <w:pStyle w:val="TOC2"/>
         <w:bidi/>
-        <w:jc w:val="both"/>
+        <w:jc w:val="right"/>
         <w:spacing w:line="580" w:lineRule="exact"/>
       </w:pPr>
       <w:r>
         <w:rPr>
           <w:rFonts w:ascii="B Nazanin" w:hAnsi="B Nazanin" w:cs="B Nazanin"/>
-          <w:sz w:val="24"/>
-          <w:szCs w:val="24"/>
+          <w:sz w:val="22"/>
+          <w:szCs w:val="22"/>
+          <w:rtl/>
         </w:rPr>
         <w:t>۱-۴. اهداف پژوهش</w:t>
       </w:r>
     </w:p>
     <w:p>
       <w:pPr>
+        <w:pStyle w:val="TOC2"/>
         <w:bidi/>
-        <w:jc w:val="both"/>
+        <w:jc w:val="right"/>
         <w:spacing w:line="580" w:lineRule="exact"/>
       </w:pPr>
       <w:r>
         <w:rPr>
           <w:rFonts w:ascii="B Nazanin" w:hAnsi="B Nazanin" w:cs="B Nazanin"/>
-          <w:sz w:val="24"/>
-          <w:szCs w:val="24"/>
+          <w:sz w:val="22"/>
+          <w:szCs w:val="22"/>
+          <w:rtl/>
         </w:rPr>
         <w:t>۱-۴-۱. هدف اصلی</w:t>
       </w:r>
     </w:p>
     <w:p>
       <w:pPr>
+        <w:pStyle w:val="TOC2"/>
         <w:bidi/>
-        <w:jc w:val="both"/>
+        <w:jc w:val="right"/>
         <w:spacing w:line="580" w:lineRule="exact"/>
       </w:pPr>
       <w:r>
         <w:rPr>
           <w:rFonts w:ascii="B Nazanin" w:hAnsi="B Nazanin" w:cs="B Nazanin"/>
-          <w:sz w:val="24"/>
-          <w:szCs w:val="24"/>
+          <w:sz w:val="22"/>
+          <w:szCs w:val="22"/>
+          <w:rtl/>
         </w:rPr>
         <w:t>۱-۴-۲. اهداف فرعی</w:t>
       </w:r>
     </w:p>
     <w:p>
       <w:pPr>
+        <w:pStyle w:val="TOC2"/>
         <w:bidi/>
-        <w:jc w:val="both"/>
+        <w:jc w:val="right"/>
         <w:spacing w:line="580" w:lineRule="exact"/>
       </w:pPr>
       <w:r>
         <w:rPr>
           <w:rFonts w:ascii="B Nazanin" w:hAnsi="B Nazanin" w:cs="B Nazanin"/>
-          <w:sz w:val="24"/>
-          <w:szCs w:val="24"/>
+          <w:sz w:val="22"/>
+          <w:szCs w:val="22"/>
+          <w:rtl/>
         </w:rPr>
         <w:t>۱-۵. فرضیه‌های پژوهش</w:t>
       </w:r>
     </w:p>
     <w:p>
       <w:pPr>
+        <w:pStyle w:val="TOC2"/>
         <w:bidi/>
-        <w:jc w:val="both"/>
+        <w:jc w:val="right"/>
         <w:spacing w:line="580" w:lineRule="exact"/>
       </w:pPr>
       <w:r>
         <w:rPr>
           <w:rFonts w:ascii="B Nazanin" w:hAnsi="B Nazanin" w:cs="B Nazanin"/>
-          <w:sz w:val="24"/>
-          <w:szCs w:val="24"/>
+          <w:sz w:val="22"/>
+          <w:szCs w:val="22"/>
+          <w:rtl/>
         </w:rPr>
         <w:t>۱-۶. تعاریف مفهومی و عملیاتی متغیرهای پژوهش</w:t>
       </w:r>
     </w:p>
     <w:p>
       <w:pPr>
+        <w:pStyle w:val="TOC2"/>
         <w:bidi/>
-        <w:jc w:val="both"/>
+        <w:jc w:val="right"/>
         <w:spacing w:line="580" w:lineRule="exact"/>
       </w:pPr>
       <w:r>
         <w:rPr>
           <w:rFonts w:ascii="B Nazanin" w:hAnsi="B Nazanin" w:cs="B Nazanin"/>
-          <w:sz w:val="24"/>
-          <w:szCs w:val="24"/>
+          <w:sz w:val="22"/>
+          <w:szCs w:val="22"/>
+          <w:rtl/>
         </w:rPr>
         <w:t>۱-۶-۱. اضطراب صفتی</w:t>
       </w:r>
     </w:p>
     <w:p>
       <w:pPr>
+        <w:pStyle w:val="TOC2"/>
         <w:bidi/>
-        <w:jc w:val="both"/>
+        <w:jc w:val="right"/>
         <w:spacing w:line="580" w:lineRule="exact"/>
       </w:pPr>
       <w:r>
         <w:rPr>
           <w:rFonts w:ascii="B Nazanin" w:hAnsi="B Nazanin" w:cs="B Nazanin"/>
-          <w:sz w:val="24"/>
-          <w:szCs w:val="24"/>
+          <w:sz w:val="22"/>
+          <w:szCs w:val="22"/>
+          <w:rtl/>
         </w:rPr>
         <w:t>۱-۶-۲. طرحواره‌های ناسازگار اولیه</w:t>
       </w:r>
     </w:p>
     <w:p>
       <w:pPr>
+        <w:pStyle w:val="TOC2"/>
         <w:bidi/>
-        <w:jc w:val="both"/>
+        <w:jc w:val="right"/>
         <w:spacing w:line="580" w:lineRule="exact"/>
       </w:pPr>
       <w:r>
         <w:rPr>
           <w:rFonts w:ascii="B Nazanin" w:hAnsi="B Nazanin" w:cs="B Nazanin"/>
-          <w:sz w:val="24"/>
-          <w:szCs w:val="24"/>
+          <w:sz w:val="22"/>
+          <w:szCs w:val="22"/>
+          <w:rtl/>
         </w:rPr>
         <w:t>۱-۶-۳. رفتارهای مالی پرخطر</w:t>
       </w:r>
     </w:p>
     <w:p>
       <w:pPr>
+        <w:pStyle w:val="TOC2"/>
         <w:bidi/>
-        <w:jc w:val="both"/>
+        <w:jc w:val="right"/>
         <w:spacing w:line="580" w:lineRule="exact"/>
       </w:pPr>
       <w:r>
         <w:rPr>
           <w:rFonts w:ascii="B Nazanin" w:hAnsi="B Nazanin" w:cs="B Nazanin"/>
-          <w:sz w:val="24"/>
-          <w:szCs w:val="24"/>
+          <w:sz w:val="22"/>
+          <w:szCs w:val="22"/>
+          <w:rtl/>
         </w:rPr>
         <w:t>۱-۷. سازمان‌بندی رساله</w:t>
       </w:r>
     </w:p>
     <w:p>
       <w:pPr>
+        <w:pStyle w:val="TOC1"/>
         <w:bidi/>
-        <w:jc w:val="both"/>
+        <w:jc w:val="right"/>
         <w:spacing w:line="580" w:lineRule="exact"/>
       </w:pPr>
       <w:r>
@@ -934,284 +961,322 @@
           <w:rFonts w:ascii="B Nazanin" w:hAnsi="B Nazanin" w:cs="B Nazanin"/>
           <w:sz w:val="24"/>
           <w:szCs w:val="24"/>
+          <w:rtl/>
         </w:rPr>
         <w:t>فصل دوم</w:t>
       </w:r>
     </w:p>
     <w:p>
       <w:pPr>
+        <w:pStyle w:val="TOC2"/>
         <w:bidi/>
-        <w:jc w:val="both"/>
+        <w:jc w:val="right"/>
         <w:spacing w:line="580" w:lineRule="exact"/>
       </w:pPr>
       <w:r>
         <w:rPr>
           <w:rFonts w:ascii="B Nazanin" w:hAnsi="B Nazanin" w:cs="B Nazanin"/>
-          <w:sz w:val="24"/>
-          <w:szCs w:val="24"/>
+          <w:sz w:val="22"/>
+          <w:szCs w:val="22"/>
+          <w:rtl/>
         </w:rPr>
         <w:t>۲-۱ مقدمه</w:t>
       </w:r>
     </w:p>
     <w:p>
       <w:pPr>
+        <w:pStyle w:val="TOC2"/>
         <w:bidi/>
-        <w:jc w:val="both"/>
+        <w:jc w:val="right"/>
         <w:spacing w:line="580" w:lineRule="exact"/>
       </w:pPr>
       <w:r>
         <w:rPr>
           <w:rFonts w:ascii="B Nazanin" w:hAnsi="B Nazanin" w:cs="B Nazanin"/>
-          <w:sz w:val="24"/>
-          <w:szCs w:val="24"/>
+          <w:sz w:val="22"/>
+          <w:szCs w:val="22"/>
+          <w:rtl/>
         </w:rPr>
         <w:t>۲-۲ مبانی نظری</w:t>
       </w:r>
     </w:p>
     <w:p>
       <w:pPr>
+        <w:pStyle w:val="TOC2"/>
         <w:bidi/>
-        <w:jc w:val="both"/>
+        <w:jc w:val="right"/>
         <w:spacing w:line="580" w:lineRule="exact"/>
       </w:pPr>
       <w:r>
         <w:rPr>
           <w:rFonts w:ascii="B Nazanin" w:hAnsi="B Nazanin" w:cs="B Nazanin"/>
-          <w:sz w:val="24"/>
-          <w:szCs w:val="24"/>
+          <w:sz w:val="22"/>
+          <w:szCs w:val="22"/>
+          <w:rtl/>
         </w:rPr>
         <w:t>۲-۲-۱ اضطراب صفتی</w:t>
       </w:r>
     </w:p>
     <w:p>
       <w:pPr>
+        <w:pStyle w:val="TOC2"/>
         <w:bidi/>
-        <w:jc w:val="both"/>
+        <w:jc w:val="right"/>
         <w:spacing w:line="580" w:lineRule="exact"/>
       </w:pPr>
       <w:r>
         <w:rPr>
           <w:rFonts w:ascii="B Nazanin" w:hAnsi="B Nazanin" w:cs="B Nazanin"/>
-          <w:sz w:val="24"/>
-          <w:szCs w:val="24"/>
+          <w:sz w:val="22"/>
+          <w:szCs w:val="22"/>
+          <w:rtl/>
         </w:rPr>
         <w:t>۲-۲-۱-۱ تمایزهای مفهومی کلیدی</w:t>
       </w:r>
     </w:p>
     <w:p>
       <w:pPr>
+        <w:pStyle w:val="TOC2"/>
         <w:bidi/>
-        <w:jc w:val="both"/>
+        <w:jc w:val="right"/>
         <w:spacing w:line="580" w:lineRule="exact"/>
       </w:pPr>
       <w:r>
         <w:rPr>
           <w:rFonts w:ascii="B Nazanin" w:hAnsi="B Nazanin" w:cs="B Nazanin"/>
-          <w:sz w:val="24"/>
-          <w:szCs w:val="24"/>
+          <w:sz w:val="22"/>
+          <w:szCs w:val="22"/>
+          <w:rtl/>
         </w:rPr>
         <w:t>۲-۲-۱-۲ مبانی زیست‌شناختی و عصب‌شناختی اضطراب</w:t>
       </w:r>
     </w:p>
     <w:p>
       <w:pPr>
+        <w:pStyle w:val="TOC2"/>
         <w:bidi/>
-        <w:jc w:val="both"/>
+        <w:jc w:val="right"/>
         <w:spacing w:line="580" w:lineRule="exact"/>
       </w:pPr>
       <w:r>
         <w:rPr>
           <w:rFonts w:ascii="B Nazanin" w:hAnsi="B Nazanin" w:cs="B Nazanin"/>
-          <w:sz w:val="24"/>
-          <w:szCs w:val="24"/>
+          <w:sz w:val="22"/>
+          <w:szCs w:val="22"/>
+          <w:rtl/>
         </w:rPr>
         <w:t>۲-۲-۱-۳ دیدگاه‌های روانشناختی درباره اضطراب</w:t>
       </w:r>
     </w:p>
     <w:p>
       <w:pPr>
+        <w:pStyle w:val="TOC2"/>
         <w:bidi/>
-        <w:jc w:val="both"/>
+        <w:jc w:val="right"/>
         <w:spacing w:line="580" w:lineRule="exact"/>
       </w:pPr>
       <w:r>
         <w:rPr>
           <w:rFonts w:ascii="B Nazanin" w:hAnsi="B Nazanin" w:cs="B Nazanin"/>
-          <w:sz w:val="24"/>
-          <w:szCs w:val="24"/>
+          <w:sz w:val="22"/>
+          <w:szCs w:val="22"/>
+          <w:rtl/>
         </w:rPr>
         <w:t>۲-۲-۱-۴ جمع‌بندی: جایگاه اضطراب صفتی در تصمیم‌گیری مالی</w:t>
       </w:r>
     </w:p>
     <w:p>
       <w:pPr>
+        <w:pStyle w:val="TOC2"/>
         <w:bidi/>
-        <w:jc w:val="both"/>
+        <w:jc w:val="right"/>
         <w:spacing w:line="580" w:lineRule="exact"/>
       </w:pPr>
       <w:r>
         <w:rPr>
           <w:rFonts w:ascii="B Nazanin" w:hAnsi="B Nazanin" w:cs="B Nazanin"/>
-          <w:sz w:val="24"/>
-          <w:szCs w:val="24"/>
+          <w:sz w:val="22"/>
+          <w:szCs w:val="22"/>
+          <w:rtl/>
         </w:rPr>
         <w:t>۲-۲-۲ طرحواره‌های ناسازگار اولیه</w:t>
       </w:r>
     </w:p>
     <w:p>
       <w:pPr>
+        <w:pStyle w:val="TOC2"/>
         <w:bidi/>
-        <w:jc w:val="both"/>
+        <w:jc w:val="right"/>
         <w:spacing w:line="580" w:lineRule="exact"/>
       </w:pPr>
       <w:r>
         <w:rPr>
           <w:rFonts w:ascii="B Nazanin" w:hAnsi="B Nazanin" w:cs="B Nazanin"/>
-          <w:sz w:val="24"/>
-          <w:szCs w:val="24"/>
+          <w:sz w:val="22"/>
+          <w:szCs w:val="22"/>
+          <w:rtl/>
         </w:rPr>
         <w:t>۲-۲-۲-۱ حوزه‌ها و طرحواره‌های ناسازگار اولیه و سبک‌های مقابله‌ای</w:t>
       </w:r>
     </w:p>
     <w:p>
       <w:pPr>
+        <w:pStyle w:val="TOC2"/>
         <w:bidi/>
-        <w:jc w:val="both"/>
+        <w:jc w:val="right"/>
         <w:spacing w:line="580" w:lineRule="exact"/>
       </w:pPr>
       <w:r>
         <w:rPr>
           <w:rFonts w:ascii="B Nazanin" w:hAnsi="B Nazanin" w:cs="B Nazanin"/>
-          <w:sz w:val="24"/>
-          <w:szCs w:val="24"/>
+          <w:sz w:val="22"/>
+          <w:szCs w:val="22"/>
+          <w:rtl/>
         </w:rPr>
         <w:t>۲-۲-۳ رفتارهای مالی پرخطر</w:t>
       </w:r>
     </w:p>
     <w:p>
       <w:pPr>
+        <w:pStyle w:val="TOC2"/>
         <w:bidi/>
-        <w:jc w:val="both"/>
+        <w:jc w:val="right"/>
         <w:spacing w:line="580" w:lineRule="exact"/>
       </w:pPr>
       <w:r>
         <w:rPr>
           <w:rFonts w:ascii="B Nazanin" w:hAnsi="B Nazanin" w:cs="B Nazanin"/>
-          <w:sz w:val="24"/>
-          <w:szCs w:val="24"/>
+          <w:sz w:val="22"/>
+          <w:szCs w:val="22"/>
+          <w:rtl/>
         </w:rPr>
         <w:t>۲-۲-۳-۱ تحمل ریسک مالی</w:t>
       </w:r>
     </w:p>
     <w:p>
       <w:pPr>
+        <w:pStyle w:val="TOC2"/>
         <w:bidi/>
-        <w:jc w:val="both"/>
+        <w:jc w:val="right"/>
         <w:spacing w:line="580" w:lineRule="exact"/>
       </w:pPr>
       <w:r>
         <w:rPr>
           <w:rFonts w:ascii="B Nazanin" w:hAnsi="B Nazanin" w:cs="B Nazanin"/>
-          <w:sz w:val="24"/>
-          <w:szCs w:val="24"/>
+          <w:sz w:val="22"/>
+          <w:szCs w:val="22"/>
+          <w:rtl/>
         </w:rPr>
         <w:t>۲-۲-۴ روابط بین متغیرها و مدل نظری میانجی‌گری</w:t>
       </w:r>
     </w:p>
     <w:p>
       <w:pPr>
+        <w:pStyle w:val="TOC2"/>
         <w:bidi/>
-        <w:jc w:val="both"/>
+        <w:jc w:val="right"/>
         <w:spacing w:line="580" w:lineRule="exact"/>
       </w:pPr>
       <w:r>
         <w:rPr>
           <w:rFonts w:ascii="B Nazanin" w:hAnsi="B Nazanin" w:cs="B Nazanin"/>
-          <w:sz w:val="24"/>
-          <w:szCs w:val="24"/>
+          <w:sz w:val="22"/>
+          <w:szCs w:val="22"/>
+          <w:rtl/>
         </w:rPr>
         <w:t>۲-۲-۴-۱ سازوکار نظری مدل میانجی‌گری</w:t>
       </w:r>
     </w:p>
     <w:p>
       <w:pPr>
+        <w:pStyle w:val="TOC2"/>
         <w:bidi/>
-        <w:jc w:val="both"/>
+        <w:jc w:val="right"/>
         <w:spacing w:line="580" w:lineRule="exact"/>
       </w:pPr>
       <w:r>
         <w:rPr>
           <w:rFonts w:ascii="B Nazanin" w:hAnsi="B Nazanin" w:cs="B Nazanin"/>
-          <w:sz w:val="24"/>
-          <w:szCs w:val="24"/>
+          <w:sz w:val="22"/>
+          <w:szCs w:val="22"/>
+          <w:rtl/>
         </w:rPr>
         <w:t>۲-۳ پیشینه پژوهشی</w:t>
       </w:r>
     </w:p>
     <w:p>
       <w:pPr>
+        <w:pStyle w:val="TOC2"/>
         <w:bidi/>
-        <w:jc w:val="both"/>
+        <w:jc w:val="right"/>
         <w:spacing w:line="580" w:lineRule="exact"/>
       </w:pPr>
       <w:r>
         <w:rPr>
           <w:rFonts w:ascii="B Nazanin" w:hAnsi="B Nazanin" w:cs="B Nazanin"/>
-          <w:sz w:val="24"/>
-          <w:szCs w:val="24"/>
+          <w:sz w:val="22"/>
+          <w:szCs w:val="22"/>
+          <w:rtl/>
         </w:rPr>
         <w:t>۲-۳-۱ پیشینه داخلی</w:t>
       </w:r>
     </w:p>
     <w:p>
       <w:pPr>
+        <w:pStyle w:val="TOC2"/>
         <w:bidi/>
-        <w:jc w:val="both"/>
+        <w:jc w:val="right"/>
         <w:spacing w:line="580" w:lineRule="exact"/>
       </w:pPr>
       <w:r>
         <w:rPr>
           <w:rFonts w:ascii="B Nazanin" w:hAnsi="B Nazanin" w:cs="B Nazanin"/>
-          <w:sz w:val="24"/>
-          <w:szCs w:val="24"/>
+          <w:sz w:val="22"/>
+          <w:szCs w:val="22"/>
+          <w:rtl/>
         </w:rPr>
         <w:t>۲-۳-۲ پیشینه خارجی</w:t>
       </w:r>
     </w:p>
     <w:p>
       <w:pPr>
+        <w:pStyle w:val="TOC2"/>
         <w:bidi/>
-        <w:jc w:val="both"/>
+        <w:jc w:val="right"/>
         <w:spacing w:line="580" w:lineRule="exact"/>
       </w:pPr>
       <w:r>
         <w:rPr>
           <w:rFonts w:ascii="B Nazanin" w:hAnsi="B Nazanin" w:cs="B Nazanin"/>
-          <w:sz w:val="24"/>
-          <w:szCs w:val="24"/>
+          <w:sz w:val="22"/>
+          <w:szCs w:val="22"/>
+          <w:rtl/>
         </w:rPr>
         <w:t>۲-۳-۳ جمع‌بندی پیشینه و شکاف پژوهشی</w:t>
       </w:r>
     </w:p>
     <w:p>
       <w:pPr>
+        <w:pStyle w:val="TOC2"/>
         <w:bidi/>
-        <w:jc w:val="both"/>
+        <w:jc w:val="right"/>
         <w:spacing w:line="580" w:lineRule="exact"/>
       </w:pPr>
       <w:r>
         <w:rPr>
           <w:rFonts w:ascii="B Nazanin" w:hAnsi="B Nazanin" w:cs="B Nazanin"/>
-          <w:sz w:val="24"/>
-          <w:szCs w:val="24"/>
+          <w:sz w:val="22"/>
+          <w:szCs w:val="22"/>
+          <w:rtl/>
         </w:rPr>
         <w:t>۲-۴ مدل مفهومی و چارچوب نهایی پژوهش</w:t>
       </w:r>
     </w:p>
     <w:p>
       <w:pPr>
+        <w:pStyle w:val="TOC1"/>
         <w:bidi/>
-        <w:jc w:val="both"/>
+        <w:jc w:val="right"/>
         <w:spacing w:line="580" w:lineRule="exact"/>
       </w:pPr>
       <w:r>
@@ -1219,224 +1284,254 @@
           <w:rFonts w:ascii="B Nazanin" w:hAnsi="B Nazanin" w:cs="B Nazanin"/>
           <w:sz w:val="24"/>
           <w:szCs w:val="24"/>
+          <w:rtl/>
         </w:rPr>
         <w:t>فصل سوم</w:t>
       </w:r>
     </w:p>
     <w:p>
       <w:pPr>
+        <w:pStyle w:val="TOC2"/>
         <w:bidi/>
-        <w:jc w:val="both"/>
+        <w:jc w:val="right"/>
         <w:spacing w:line="580" w:lineRule="exact"/>
       </w:pPr>
       <w:r>
         <w:rPr>
           <w:rFonts w:ascii="B Nazanin" w:hAnsi="B Nazanin" w:cs="B Nazanin"/>
-          <w:sz w:val="24"/>
-          <w:szCs w:val="24"/>
+          <w:sz w:val="22"/>
+          <w:szCs w:val="22"/>
+          <w:rtl/>
         </w:rPr>
         <w:t>۳-۱. مقدمه</w:t>
       </w:r>
     </w:p>
     <w:p>
       <w:pPr>
+        <w:pStyle w:val="TOC2"/>
         <w:bidi/>
-        <w:jc w:val="both"/>
+        <w:jc w:val="right"/>
         <w:spacing w:line="580" w:lineRule="exact"/>
       </w:pPr>
       <w:r>
         <w:rPr>
           <w:rFonts w:ascii="B Nazanin" w:hAnsi="B Nazanin" w:cs="B Nazanin"/>
-          <w:sz w:val="24"/>
-          <w:szCs w:val="24"/>
+          <w:sz w:val="22"/>
+          <w:szCs w:val="22"/>
+          <w:rtl/>
         </w:rPr>
         <w:t>۳-۲. طرح پژوهش</w:t>
       </w:r>
     </w:p>
     <w:p>
       <w:pPr>
+        <w:pStyle w:val="TOC2"/>
         <w:bidi/>
-        <w:jc w:val="both"/>
+        <w:jc w:val="right"/>
         <w:spacing w:line="580" w:lineRule="exact"/>
       </w:pPr>
       <w:r>
         <w:rPr>
           <w:rFonts w:ascii="B Nazanin" w:hAnsi="B Nazanin" w:cs="B Nazanin"/>
-          <w:sz w:val="24"/>
-          <w:szCs w:val="24"/>
+          <w:sz w:val="22"/>
+          <w:szCs w:val="22"/>
+          <w:rtl/>
         </w:rPr>
         <w:t>۳-۳. جامعه آماری، نمونه و روش نمونه‌گیری</w:t>
       </w:r>
     </w:p>
     <w:p>
       <w:pPr>
+        <w:pStyle w:val="TOC2"/>
         <w:bidi/>
-        <w:jc w:val="both"/>
+        <w:jc w:val="right"/>
         <w:spacing w:line="580" w:lineRule="exact"/>
       </w:pPr>
       <w:r>
         <w:rPr>
           <w:rFonts w:ascii="B Nazanin" w:hAnsi="B Nazanin" w:cs="B Nazanin"/>
-          <w:sz w:val="24"/>
-          <w:szCs w:val="24"/>
+          <w:sz w:val="22"/>
+          <w:szCs w:val="22"/>
+          <w:rtl/>
         </w:rPr>
         <w:t>۳-۳-۱. جامعه آماری</w:t>
       </w:r>
     </w:p>
     <w:p>
       <w:pPr>
+        <w:pStyle w:val="TOC2"/>
         <w:bidi/>
-        <w:jc w:val="both"/>
+        <w:jc w:val="right"/>
         <w:spacing w:line="580" w:lineRule="exact"/>
       </w:pPr>
       <w:r>
         <w:rPr>
           <w:rFonts w:ascii="B Nazanin" w:hAnsi="B Nazanin" w:cs="B Nazanin"/>
-          <w:sz w:val="24"/>
-          <w:szCs w:val="24"/>
+          <w:sz w:val="22"/>
+          <w:szCs w:val="22"/>
+          <w:rtl/>
         </w:rPr>
         <w:t>۳-۳-۲. روش نمونه‌گیری و گردآوری داده‌ها</w:t>
       </w:r>
     </w:p>
     <w:p>
       <w:pPr>
+        <w:pStyle w:val="TOC2"/>
         <w:bidi/>
-        <w:jc w:val="both"/>
+        <w:jc w:val="right"/>
         <w:spacing w:line="580" w:lineRule="exact"/>
       </w:pPr>
       <w:r>
         <w:rPr>
           <w:rFonts w:ascii="B Nazanin" w:hAnsi="B Nazanin" w:cs="B Nazanin"/>
-          <w:sz w:val="24"/>
-          <w:szCs w:val="24"/>
+          <w:sz w:val="22"/>
+          <w:szCs w:val="22"/>
+          <w:rtl/>
         </w:rPr>
         <w:t>۳-۳-۳. حجم نمونه</w:t>
       </w:r>
     </w:p>
     <w:p>
       <w:pPr>
+        <w:pStyle w:val="TOC2"/>
         <w:bidi/>
-        <w:jc w:val="both"/>
+        <w:jc w:val="right"/>
         <w:spacing w:line="580" w:lineRule="exact"/>
       </w:pPr>
       <w:r>
         <w:rPr>
           <w:rFonts w:ascii="B Nazanin" w:hAnsi="B Nazanin" w:cs="B Nazanin"/>
-          <w:sz w:val="24"/>
-          <w:szCs w:val="24"/>
+          <w:sz w:val="22"/>
+          <w:szCs w:val="22"/>
+          <w:rtl/>
         </w:rPr>
         <w:t>۳-۳-۴. ملاک‌های ورود و خروج</w:t>
       </w:r>
     </w:p>
     <w:p>
       <w:pPr>
+        <w:pStyle w:val="TOC2"/>
         <w:bidi/>
-        <w:jc w:val="both"/>
+        <w:jc w:val="right"/>
         <w:spacing w:line="580" w:lineRule="exact"/>
       </w:pPr>
       <w:r>
         <w:rPr>
           <w:rFonts w:ascii="B Nazanin" w:hAnsi="B Nazanin" w:cs="B Nazanin"/>
-          <w:sz w:val="24"/>
-          <w:szCs w:val="24"/>
+          <w:sz w:val="22"/>
+          <w:szCs w:val="22"/>
+          <w:rtl/>
         </w:rPr>
         <w:t>۳-۴. ابزارهای اندازه‌گیری</w:t>
       </w:r>
     </w:p>
     <w:p>
       <w:pPr>
+        <w:pStyle w:val="TOC2"/>
         <w:bidi/>
-        <w:jc w:val="both"/>
+        <w:jc w:val="right"/>
         <w:spacing w:line="580" w:lineRule="exact"/>
       </w:pPr>
       <w:r>
         <w:rPr>
           <w:rFonts w:ascii="B Nazanin" w:hAnsi="B Nazanin" w:cs="B Nazanin"/>
-          <w:sz w:val="24"/>
-          <w:szCs w:val="24"/>
+          <w:sz w:val="22"/>
+          <w:szCs w:val="22"/>
+          <w:rtl/>
         </w:rPr>
         <w:t>۳-۴-۱. پرسشنامه اضطراب حالت-صفت اسپیلبرگر — فرم صفتی</w:t>
       </w:r>
     </w:p>
     <w:p>
       <w:pPr>
+        <w:pStyle w:val="TOC2"/>
         <w:bidi/>
-        <w:jc w:val="both"/>
+        <w:jc w:val="right"/>
         <w:spacing w:line="580" w:lineRule="exact"/>
       </w:pPr>
       <w:r>
         <w:rPr>
           <w:rFonts w:ascii="B Nazanin" w:hAnsi="B Nazanin" w:cs="B Nazanin"/>
-          <w:sz w:val="24"/>
-          <w:szCs w:val="24"/>
+          <w:sz w:val="22"/>
+          <w:szCs w:val="22"/>
+          <w:rtl/>
         </w:rPr>
         <w:t>۳-۴-۲. پرسشنامه طرحواره‌های ناسازگار اولیه یانگ — فرم کوتاه</w:t>
       </w:r>
     </w:p>
     <w:p>
       <w:pPr>
+        <w:pStyle w:val="TOC2"/>
         <w:bidi/>
-        <w:jc w:val="both"/>
+        <w:jc w:val="right"/>
         <w:spacing w:line="580" w:lineRule="exact"/>
       </w:pPr>
       <w:r>
         <w:rPr>
           <w:rFonts w:ascii="B Nazanin" w:hAnsi="B Nazanin" w:cs="B Nazanin"/>
-          <w:sz w:val="24"/>
-          <w:szCs w:val="24"/>
+          <w:sz w:val="22"/>
+          <w:szCs w:val="22"/>
+          <w:rtl/>
         </w:rPr>
         <w:t>۳-۴-۳. مقیاس تحمل ریسک مالی گرابل و لایتون</w:t>
       </w:r>
     </w:p>
     <w:p>
       <w:pPr>
+        <w:pStyle w:val="TOC2"/>
         <w:bidi/>
-        <w:jc w:val="both"/>
+        <w:jc w:val="right"/>
         <w:spacing w:line="580" w:lineRule="exact"/>
       </w:pPr>
       <w:r>
         <w:rPr>
           <w:rFonts w:ascii="B Nazanin" w:hAnsi="B Nazanin" w:cs="B Nazanin"/>
-          <w:sz w:val="24"/>
-          <w:szCs w:val="24"/>
+          <w:sz w:val="22"/>
+          <w:szCs w:val="22"/>
+          <w:rtl/>
         </w:rPr>
         <w:t>۳-۵. روش اجرای پژوهش</w:t>
       </w:r>
     </w:p>
     <w:p>
       <w:pPr>
+        <w:pStyle w:val="TOC2"/>
         <w:bidi/>
-        <w:jc w:val="both"/>
+        <w:jc w:val="right"/>
         <w:spacing w:line="580" w:lineRule="exact"/>
       </w:pPr>
       <w:r>
         <w:rPr>
           <w:rFonts w:ascii="B Nazanin" w:hAnsi="B Nazanin" w:cs="B Nazanin"/>
-          <w:sz w:val="24"/>
-          <w:szCs w:val="24"/>
+          <w:sz w:val="22"/>
+          <w:szCs w:val="22"/>
+          <w:rtl/>
         </w:rPr>
         <w:t>۳-۶. روش تحلیل داده‌ها</w:t>
       </w:r>
     </w:p>
     <w:p>
       <w:pPr>
+        <w:pStyle w:val="TOC2"/>
         <w:bidi/>
-        <w:jc w:val="both"/>
+        <w:jc w:val="right"/>
         <w:spacing w:line="580" w:lineRule="exact"/>
       </w:pPr>
       <w:r>
         <w:rPr>
           <w:rFonts w:ascii="B Nazanin" w:hAnsi="B Nazanin" w:cs="B Nazanin"/>
-          <w:sz w:val="24"/>
-          <w:szCs w:val="24"/>
+          <w:sz w:val="22"/>
+          <w:szCs w:val="22"/>
+          <w:rtl/>
         </w:rPr>
         <w:t>۳-۷. ملاحظات اخلاقی</w:t>
       </w:r>
     </w:p>
     <w:p>
       <w:pPr>
+        <w:pStyle w:val="TOC1"/>
         <w:bidi/>
-        <w:jc w:val="both"/>
+        <w:jc w:val="right"/>
         <w:spacing w:line="580" w:lineRule="exact"/>
       </w:pPr>
       <w:r>
@@ -1444,164 +1539,186 @@
           <w:rFonts w:ascii="B Nazanin" w:hAnsi="B Nazanin" w:cs="B Nazanin"/>
           <w:sz w:val="24"/>
           <w:szCs w:val="24"/>
+          <w:rtl/>
         </w:rPr>
         <w:t>فصل چهارم: یافته‌های پژوهش</w:t>
       </w:r>
     </w:p>
     <w:p>
       <w:pPr>
+        <w:pStyle w:val="TOC2"/>
         <w:bidi/>
-        <w:jc w:val="both"/>
+        <w:jc w:val="right"/>
         <w:spacing w:line="580" w:lineRule="exact"/>
       </w:pPr>
       <w:r>
         <w:rPr>
           <w:rFonts w:ascii="B Nazanin" w:hAnsi="B Nazanin" w:cs="B Nazanin"/>
-          <w:sz w:val="24"/>
-          <w:szCs w:val="24"/>
+          <w:sz w:val="22"/>
+          <w:szCs w:val="22"/>
+          <w:rtl/>
         </w:rPr>
         <w:t>۴-۱. مقدمه</w:t>
       </w:r>
     </w:p>
     <w:p>
       <w:pPr>
+        <w:pStyle w:val="TOC2"/>
         <w:bidi/>
-        <w:jc w:val="both"/>
+        <w:jc w:val="right"/>
         <w:spacing w:line="580" w:lineRule="exact"/>
       </w:pPr>
       <w:r>
         <w:rPr>
           <w:rFonts w:ascii="B Nazanin" w:hAnsi="B Nazanin" w:cs="B Nazanin"/>
-          <w:sz w:val="24"/>
-          <w:szCs w:val="24"/>
+          <w:sz w:val="22"/>
+          <w:szCs w:val="22"/>
+          <w:rtl/>
         </w:rPr>
         <w:t>۴-۲. آماده‌سازی و غربالگری داده‌ها</w:t>
       </w:r>
     </w:p>
     <w:p>
       <w:pPr>
+        <w:pStyle w:val="TOC2"/>
         <w:bidi/>
-        <w:jc w:val="both"/>
+        <w:jc w:val="right"/>
         <w:spacing w:line="580" w:lineRule="exact"/>
       </w:pPr>
       <w:r>
         <w:rPr>
           <w:rFonts w:ascii="B Nazanin" w:hAnsi="B Nazanin" w:cs="B Nazanin"/>
-          <w:sz w:val="24"/>
-          <w:szCs w:val="24"/>
+          <w:sz w:val="22"/>
+          <w:szCs w:val="22"/>
+          <w:rtl/>
         </w:rPr>
         <w:t>۴-۳. ویژگی‌های جمعیت‌شناختی و معاملاتی نمونه</w:t>
       </w:r>
     </w:p>
     <w:p>
       <w:pPr>
+        <w:pStyle w:val="TOC2"/>
         <w:bidi/>
-        <w:jc w:val="both"/>
+        <w:jc w:val="right"/>
         <w:spacing w:line="580" w:lineRule="exact"/>
       </w:pPr>
       <w:r>
         <w:rPr>
           <w:rFonts w:ascii="B Nazanin" w:hAnsi="B Nazanin" w:cs="B Nazanin"/>
-          <w:sz w:val="24"/>
-          <w:szCs w:val="24"/>
+          <w:sz w:val="22"/>
+          <w:szCs w:val="22"/>
+          <w:rtl/>
         </w:rPr>
         <w:t>۴-۴. شاخص‌های توصیفی متغیرهای اصلی پژوهش</w:t>
       </w:r>
     </w:p>
     <w:p>
       <w:pPr>
+        <w:pStyle w:val="TOC2"/>
         <w:bidi/>
-        <w:jc w:val="both"/>
+        <w:jc w:val="right"/>
         <w:spacing w:line="580" w:lineRule="exact"/>
       </w:pPr>
       <w:r>
         <w:rPr>
           <w:rFonts w:ascii="B Nazanin" w:hAnsi="B Nazanin" w:cs="B Nazanin"/>
-          <w:sz w:val="24"/>
-          <w:szCs w:val="24"/>
+          <w:sz w:val="22"/>
+          <w:szCs w:val="22"/>
+          <w:rtl/>
         </w:rPr>
         <w:t>۴-۵. پایایی ابزارهای اندازه‌گیری</w:t>
       </w:r>
     </w:p>
     <w:p>
       <w:pPr>
+        <w:pStyle w:val="TOC2"/>
         <w:bidi/>
-        <w:jc w:val="both"/>
+        <w:jc w:val="right"/>
         <w:spacing w:line="580" w:lineRule="exact"/>
       </w:pPr>
       <w:r>
         <w:rPr>
           <w:rFonts w:ascii="B Nazanin" w:hAnsi="B Nazanin" w:cs="B Nazanin"/>
-          <w:sz w:val="24"/>
-          <w:szCs w:val="24"/>
+          <w:sz w:val="22"/>
+          <w:szCs w:val="22"/>
+          <w:rtl/>
         </w:rPr>
         <w:t>۴-۶. ارزیابی پیش‌فرض‌های آماری</w:t>
       </w:r>
     </w:p>
     <w:p>
       <w:pPr>
+        <w:pStyle w:val="TOC2"/>
         <w:bidi/>
-        <w:jc w:val="both"/>
+        <w:jc w:val="right"/>
         <w:spacing w:line="580" w:lineRule="exact"/>
       </w:pPr>
       <w:r>
         <w:rPr>
           <w:rFonts w:ascii="B Nazanin" w:hAnsi="B Nazanin" w:cs="B Nazanin"/>
-          <w:sz w:val="24"/>
-          <w:szCs w:val="24"/>
+          <w:sz w:val="22"/>
+          <w:szCs w:val="22"/>
+          <w:rtl/>
         </w:rPr>
         <w:t>۴-۷. همبستگی پیرسون و آزمون فرضیه‌های فرعی</w:t>
       </w:r>
     </w:p>
     <w:p>
       <w:pPr>
+        <w:pStyle w:val="TOC2"/>
         <w:bidi/>
-        <w:jc w:val="both"/>
+        <w:jc w:val="right"/>
         <w:spacing w:line="580" w:lineRule="exact"/>
       </w:pPr>
       <w:r>
         <w:rPr>
           <w:rFonts w:ascii="B Nazanin" w:hAnsi="B Nazanin" w:cs="B Nazanin"/>
-          <w:sz w:val="24"/>
-          <w:szCs w:val="24"/>
+          <w:sz w:val="22"/>
+          <w:szCs w:val="22"/>
+          <w:rtl/>
         </w:rPr>
         <w:t>۴-۸. آزمون فرضیه اصلی: تحلیل میانجی‌گری</w:t>
       </w:r>
     </w:p>
     <w:p>
       <w:pPr>
+        <w:pStyle w:val="TOC2"/>
         <w:bidi/>
-        <w:jc w:val="both"/>
+        <w:jc w:val="right"/>
         <w:spacing w:line="580" w:lineRule="exact"/>
       </w:pPr>
       <w:r>
         <w:rPr>
           <w:rFonts w:ascii="B Nazanin" w:hAnsi="B Nazanin" w:cs="B Nazanin"/>
-          <w:sz w:val="24"/>
-          <w:szCs w:val="24"/>
+          <w:sz w:val="22"/>
+          <w:szCs w:val="22"/>
+          <w:rtl/>
         </w:rPr>
         <w:t>۴-۹. تحلیل مسیر با متغیرهای مشاهده‌شده</w:t>
       </w:r>
     </w:p>
     <w:p>
       <w:pPr>
+        <w:pStyle w:val="TOC2"/>
         <w:bidi/>
-        <w:jc w:val="both"/>
+        <w:jc w:val="right"/>
         <w:spacing w:line="580" w:lineRule="exact"/>
       </w:pPr>
       <w:r>
         <w:rPr>
           <w:rFonts w:ascii="B Nazanin" w:hAnsi="B Nazanin" w:cs="B Nazanin"/>
-          <w:sz w:val="24"/>
-          <w:szCs w:val="24"/>
+          <w:sz w:val="22"/>
+          <w:szCs w:val="22"/>
+          <w:rtl/>
         </w:rPr>
         <w:t>۴-۱۰. جمع‌بندی یافته‌ها</w:t>
       </w:r>
     </w:p>
     <w:p>
       <w:pPr>
+        <w:pStyle w:val="TOC1"/>
         <w:bidi/>
-        <w:jc w:val="both"/>
+        <w:jc w:val="right"/>
         <w:spacing w:line="580" w:lineRule="exact"/>
       </w:pPr>
       <w:r>
@@ -1609,209 +1726,237 @@
           <w:rFonts w:ascii="B Nazanin" w:hAnsi="B Nazanin" w:cs="B Nazanin"/>
           <w:sz w:val="24"/>
           <w:szCs w:val="24"/>
+          <w:rtl/>
         </w:rPr>
         <w:t>فصل پنجم: بحث و نتیجه‌گیری</w:t>
       </w:r>
     </w:p>
     <w:p>
       <w:pPr>
+        <w:pStyle w:val="TOC2"/>
         <w:bidi/>
-        <w:jc w:val="both"/>
+        <w:jc w:val="right"/>
         <w:spacing w:line="580" w:lineRule="exact"/>
       </w:pPr>
       <w:r>
         <w:rPr>
           <w:rFonts w:ascii="B Nazanin" w:hAnsi="B Nazanin" w:cs="B Nazanin"/>
-          <w:sz w:val="24"/>
-          <w:szCs w:val="24"/>
+          <w:sz w:val="22"/>
+          <w:szCs w:val="22"/>
+          <w:rtl/>
         </w:rPr>
         <w:t>۵-۱. مقدمه</w:t>
       </w:r>
     </w:p>
     <w:p>
       <w:pPr>
+        <w:pStyle w:val="TOC2"/>
         <w:bidi/>
-        <w:jc w:val="both"/>
+        <w:jc w:val="right"/>
         <w:spacing w:line="580" w:lineRule="exact"/>
       </w:pPr>
       <w:r>
         <w:rPr>
           <w:rFonts w:ascii="B Nazanin" w:hAnsi="B Nazanin" w:cs="B Nazanin"/>
-          <w:sz w:val="24"/>
-          <w:szCs w:val="24"/>
+          <w:sz w:val="22"/>
+          <w:szCs w:val="22"/>
+          <w:rtl/>
         </w:rPr>
         <w:t>۵-۲. خلاصه یافته‌ها</w:t>
       </w:r>
     </w:p>
     <w:p>
       <w:pPr>
+        <w:pStyle w:val="TOC2"/>
         <w:bidi/>
-        <w:jc w:val="both"/>
+        <w:jc w:val="right"/>
         <w:spacing w:line="580" w:lineRule="exact"/>
       </w:pPr>
       <w:r>
         <w:rPr>
           <w:rFonts w:ascii="B Nazanin" w:hAnsi="B Nazanin" w:cs="B Nazanin"/>
-          <w:sz w:val="24"/>
-          <w:szCs w:val="24"/>
+          <w:sz w:val="22"/>
+          <w:szCs w:val="22"/>
+          <w:rtl/>
         </w:rPr>
         <w:t>۵-۳. بحث درباره یافته‌ها</w:t>
       </w:r>
     </w:p>
     <w:p>
       <w:pPr>
+        <w:pStyle w:val="TOC2"/>
         <w:bidi/>
-        <w:jc w:val="both"/>
+        <w:jc w:val="right"/>
         <w:spacing w:line="580" w:lineRule="exact"/>
       </w:pPr>
       <w:r>
         <w:rPr>
           <w:rFonts w:ascii="B Nazanin" w:hAnsi="B Nazanin" w:cs="B Nazanin"/>
-          <w:sz w:val="24"/>
-          <w:szCs w:val="24"/>
+          <w:sz w:val="22"/>
+          <w:szCs w:val="22"/>
+          <w:rtl/>
         </w:rPr>
         <w:t>۵-۳-۱. فرضیه اصلی: میانجی‌گری جزئی طرحواره‌های ناسازگار اولیه</w:t>
       </w:r>
     </w:p>
     <w:p>
       <w:pPr>
+        <w:pStyle w:val="TOC2"/>
         <w:bidi/>
-        <w:jc w:val="both"/>
+        <w:jc w:val="right"/>
         <w:spacing w:line="580" w:lineRule="exact"/>
       </w:pPr>
       <w:r>
         <w:rPr>
           <w:rFonts w:ascii="B Nazanin" w:hAnsi="B Nazanin" w:cs="B Nazanin"/>
-          <w:sz w:val="24"/>
-          <w:szCs w:val="24"/>
+          <w:sz w:val="22"/>
+          <w:szCs w:val="22"/>
+          <w:rtl/>
         </w:rPr>
         <w:t>۵-۳-۲. فرضیه دوم: رابطه اضطراب صفتی با رفتارهای مالی پرخطر</w:t>
       </w:r>
     </w:p>
     <w:p>
       <w:pPr>
+        <w:pStyle w:val="TOC2"/>
         <w:bidi/>
-        <w:jc w:val="both"/>
+        <w:jc w:val="right"/>
         <w:spacing w:line="580" w:lineRule="exact"/>
       </w:pPr>
       <w:r>
         <w:rPr>
           <w:rFonts w:ascii="B Nazanin" w:hAnsi="B Nazanin" w:cs="B Nazanin"/>
-          <w:sz w:val="24"/>
-          <w:szCs w:val="24"/>
+          <w:sz w:val="22"/>
+          <w:szCs w:val="22"/>
+          <w:rtl/>
         </w:rPr>
         <w:t>۵-۳-۳. فرضیه سوم: رابطه اضطراب صفتی با طرحواره‌های ناسازگار اولیه</w:t>
       </w:r>
     </w:p>
     <w:p>
       <w:pPr>
+        <w:pStyle w:val="TOC2"/>
         <w:bidi/>
-        <w:jc w:val="both"/>
+        <w:jc w:val="right"/>
         <w:spacing w:line="580" w:lineRule="exact"/>
       </w:pPr>
       <w:r>
         <w:rPr>
           <w:rFonts w:ascii="B Nazanin" w:hAnsi="B Nazanin" w:cs="B Nazanin"/>
-          <w:sz w:val="24"/>
-          <w:szCs w:val="24"/>
+          <w:sz w:val="22"/>
+          <w:szCs w:val="22"/>
+          <w:rtl/>
         </w:rPr>
         <w:t>۵-۳-۴. فرضیه چهارم: رابطه طرحواره‌های ناسازگار اولیه با رفتارهای مالی پرخطر</w:t>
       </w:r>
     </w:p>
     <w:p>
       <w:pPr>
+        <w:pStyle w:val="TOC2"/>
         <w:bidi/>
-        <w:jc w:val="both"/>
+        <w:jc w:val="right"/>
         <w:spacing w:line="580" w:lineRule="exact"/>
       </w:pPr>
       <w:r>
         <w:rPr>
           <w:rFonts w:ascii="B Nazanin" w:hAnsi="B Nazanin" w:cs="B Nazanin"/>
-          <w:sz w:val="24"/>
-          <w:szCs w:val="24"/>
+          <w:sz w:val="22"/>
+          <w:szCs w:val="22"/>
+          <w:rtl/>
         </w:rPr>
         <w:t>۵-۳-۵. جمع‌بندی نظری بحث</w:t>
       </w:r>
     </w:p>
     <w:p>
       <w:pPr>
+        <w:pStyle w:val="TOC2"/>
         <w:bidi/>
-        <w:jc w:val="both"/>
+        <w:jc w:val="right"/>
         <w:spacing w:line="580" w:lineRule="exact"/>
       </w:pPr>
       <w:r>
         <w:rPr>
           <w:rFonts w:ascii="B Nazanin" w:hAnsi="B Nazanin" w:cs="B Nazanin"/>
-          <w:sz w:val="24"/>
-          <w:szCs w:val="24"/>
+          <w:sz w:val="22"/>
+          <w:szCs w:val="22"/>
+          <w:rtl/>
         </w:rPr>
         <w:t>۵-۴. همسویی و ناهمسویی یافته‌ها با پیشینه پژوهش</w:t>
       </w:r>
     </w:p>
     <w:p>
       <w:pPr>
+        <w:pStyle w:val="TOC2"/>
         <w:bidi/>
-        <w:jc w:val="both"/>
+        <w:jc w:val="right"/>
         <w:spacing w:line="580" w:lineRule="exact"/>
       </w:pPr>
       <w:r>
         <w:rPr>
           <w:rFonts w:ascii="B Nazanin" w:hAnsi="B Nazanin" w:cs="B Nazanin"/>
-          <w:sz w:val="24"/>
-          <w:szCs w:val="24"/>
+          <w:sz w:val="22"/>
+          <w:szCs w:val="22"/>
+          <w:rtl/>
         </w:rPr>
         <w:t>۵-۵. دلالت‌های کاربردی</w:t>
       </w:r>
     </w:p>
     <w:p>
       <w:pPr>
+        <w:pStyle w:val="TOC2"/>
         <w:bidi/>
-        <w:jc w:val="both"/>
+        <w:jc w:val="right"/>
         <w:spacing w:line="580" w:lineRule="exact"/>
       </w:pPr>
       <w:r>
         <w:rPr>
           <w:rFonts w:ascii="B Nazanin" w:hAnsi="B Nazanin" w:cs="B Nazanin"/>
-          <w:sz w:val="24"/>
-          <w:szCs w:val="24"/>
+          <w:sz w:val="22"/>
+          <w:szCs w:val="22"/>
+          <w:rtl/>
         </w:rPr>
         <w:t>۵-۶. محدودیت‌های پژوهش</w:t>
       </w:r>
     </w:p>
     <w:p>
       <w:pPr>
+        <w:pStyle w:val="TOC2"/>
         <w:bidi/>
-        <w:jc w:val="both"/>
+        <w:jc w:val="right"/>
         <w:spacing w:line="580" w:lineRule="exact"/>
       </w:pPr>
       <w:r>
         <w:rPr>
           <w:rFonts w:ascii="B Nazanin" w:hAnsi="B Nazanin" w:cs="B Nazanin"/>
-          <w:sz w:val="24"/>
-          <w:szCs w:val="24"/>
+          <w:sz w:val="22"/>
+          <w:szCs w:val="22"/>
+          <w:rtl/>
         </w:rPr>
         <w:t>۵-۷. پیشنهادها برای پژوهش‌های آینده</w:t>
       </w:r>
     </w:p>
     <w:p>
       <w:pPr>
+        <w:pStyle w:val="TOC2"/>
         <w:bidi/>
-        <w:jc w:val="both"/>
+        <w:jc w:val="right"/>
         <w:spacing w:line="580" w:lineRule="exact"/>
       </w:pPr>
       <w:r>
         <w:rPr>
           <w:rFonts w:ascii="B Nazanin" w:hAnsi="B Nazanin" w:cs="B Nazanin"/>
-          <w:sz w:val="24"/>
-          <w:szCs w:val="24"/>
+          <w:sz w:val="22"/>
+          <w:szCs w:val="22"/>
+          <w:rtl/>
         </w:rPr>
         <w:t>۵-۸. جمع‌بندی نهایی</w:t>
       </w:r>
     </w:p>
     <w:p>
       <w:pPr>
+        <w:pStyle w:val="TOC1"/>
         <w:bidi/>
-        <w:jc w:val="both"/>
+        <w:jc w:val="right"/>
         <w:spacing w:line="580" w:lineRule="exact"/>
       </w:pPr>
       <w:r>
@@ -1819,6 +1964,7 @@
           <w:rFonts w:ascii="B Nazanin" w:hAnsi="B Nazanin" w:cs="B Nazanin"/>
           <w:sz w:val="24"/>
           <w:szCs w:val="24"/>
+          <w:rtl/>
         </w:rPr>
         <w:t>منابع</w:t>
       </w:r>
@@ -1878,8 +2024,9 @@
     </w:p>
     <w:p>
       <w:pPr>
+        <w:pStyle w:val="tableoffigures"/>
         <w:bidi/>
-        <w:jc w:val="both"/>
+        <w:jc w:val="right"/>
         <w:spacing w:line="580" w:lineRule="exact"/>
       </w:pPr>
       <w:r>
@@ -1887,14 +2034,16 @@
           <w:rFonts w:ascii="B Nazanin" w:hAnsi="B Nazanin" w:cs="B Nazanin"/>
           <w:sz w:val="24"/>
           <w:szCs w:val="24"/>
+          <w:rtl/>
         </w:rPr>
         <w:t>جدول ۲-۱. حوزه‌ها و طرحواره‌های ناسازگار اولیه در مدل یانگ</w:t>
       </w:r>
     </w:p>
     <w:p>
       <w:pPr>
+        <w:pStyle w:val="tableoffigures"/>
         <w:bidi/>
-        <w:jc w:val="both"/>
+        <w:jc w:val="right"/>
         <w:spacing w:line="580" w:lineRule="exact"/>
       </w:pPr>
       <w:r>
@@ -1902,14 +2051,16 @@
           <w:rFonts w:ascii="B Nazanin" w:hAnsi="B Nazanin" w:cs="B Nazanin"/>
           <w:sz w:val="24"/>
           <w:szCs w:val="24"/>
+          <w:rtl/>
         </w:rPr>
         <w:t>جدول ۳-۱. خلاصه ابزارهای پژوهش</w:t>
       </w:r>
     </w:p>
     <w:p>
       <w:pPr>
+        <w:pStyle w:val="tableoffigures"/>
         <w:bidi/>
-        <w:jc w:val="both"/>
+        <w:jc w:val="right"/>
         <w:spacing w:line="580" w:lineRule="exact"/>
       </w:pPr>
       <w:r>
@@ -1917,14 +2068,16 @@
           <w:rFonts w:ascii="B Nazanin" w:hAnsi="B Nazanin" w:cs="B Nazanin"/>
           <w:sz w:val="24"/>
           <w:szCs w:val="24"/>
+          <w:rtl/>
         </w:rPr>
         <w:t>جدول ۴-۱. روند غربالگری و ریزش پاسخ‌ها</w:t>
       </w:r>
     </w:p>
     <w:p>
       <w:pPr>
+        <w:pStyle w:val="tableoffigures"/>
         <w:bidi/>
-        <w:jc w:val="both"/>
+        <w:jc w:val="right"/>
         <w:spacing w:line="580" w:lineRule="exact"/>
       </w:pPr>
       <w:r>
@@ -1932,14 +2085,16 @@
           <w:rFonts w:ascii="B Nazanin" w:hAnsi="B Nazanin" w:cs="B Nazanin"/>
           <w:sz w:val="24"/>
           <w:szCs w:val="24"/>
+          <w:rtl/>
         </w:rPr>
         <w:t>جدول ۴-۲. توزیع ویژگی‌های جمعیت‌شناختی نمونه نهایی</w:t>
       </w:r>
     </w:p>
     <w:p>
       <w:pPr>
+        <w:pStyle w:val="tableoffigures"/>
         <w:bidi/>
-        <w:jc w:val="both"/>
+        <w:jc w:val="right"/>
         <w:spacing w:line="580" w:lineRule="exact"/>
       </w:pPr>
       <w:r>
@@ -1947,14 +2102,16 @@
           <w:rFonts w:ascii="B Nazanin" w:hAnsi="B Nazanin" w:cs="B Nazanin"/>
           <w:sz w:val="24"/>
           <w:szCs w:val="24"/>
+          <w:rtl/>
         </w:rPr>
         <w:t>جدول ۴-۳. توزیع ویژگی‌های معاملاتی نمونه نهایی</w:t>
       </w:r>
     </w:p>
     <w:p>
       <w:pPr>
+        <w:pStyle w:val="tableoffigures"/>
         <w:bidi/>
-        <w:jc w:val="both"/>
+        <w:jc w:val="right"/>
         <w:spacing w:line="580" w:lineRule="exact"/>
       </w:pPr>
       <w:r>
@@ -1962,14 +2119,16 @@
           <w:rFonts w:ascii="B Nazanin" w:hAnsi="B Nazanin" w:cs="B Nazanin"/>
           <w:sz w:val="24"/>
           <w:szCs w:val="24"/>
+          <w:rtl/>
         </w:rPr>
         <w:t>جدول ۴-۴. شاخص‌های توصیفی نمره‌های کل</w:t>
       </w:r>
     </w:p>
     <w:p>
       <w:pPr>
+        <w:pStyle w:val="tableoffigures"/>
         <w:bidi/>
-        <w:jc w:val="both"/>
+        <w:jc w:val="right"/>
         <w:spacing w:line="580" w:lineRule="exact"/>
       </w:pPr>
       <w:r>
@@ -1977,14 +2136,16 @@
           <w:rFonts w:ascii="B Nazanin" w:hAnsi="B Nazanin" w:cs="B Nazanin"/>
           <w:sz w:val="24"/>
           <w:szCs w:val="24"/>
+          <w:rtl/>
         </w:rPr>
         <w:t>جدول ۴-۵. پایایی ابزارها و خرده‌مقیاس‌ها (آلفای کرونباخ)</w:t>
       </w:r>
     </w:p>
     <w:p>
       <w:pPr>
+        <w:pStyle w:val="tableoffigures"/>
         <w:bidi/>
-        <w:jc w:val="both"/>
+        <w:jc w:val="right"/>
         <w:spacing w:line="580" w:lineRule="exact"/>
       </w:pPr>
       <w:r>
@@ -1992,14 +2153,16 @@
           <w:rFonts w:ascii="B Nazanin" w:hAnsi="B Nazanin" w:cs="B Nazanin"/>
           <w:sz w:val="24"/>
           <w:szCs w:val="24"/>
+          <w:rtl/>
         </w:rPr>
         <w:t>جدول ۴-۶. ماتریس همبستگی پیرسون متغیرهای پژوهش</w:t>
       </w:r>
     </w:p>
     <w:p>
       <w:pPr>
+        <w:pStyle w:val="tableoffigures"/>
         <w:bidi/>
-        <w:jc w:val="both"/>
+        <w:jc w:val="right"/>
         <w:spacing w:line="580" w:lineRule="exact"/>
       </w:pPr>
       <w:r>
@@ -2007,14 +2170,16 @@
           <w:rFonts w:ascii="B Nazanin" w:hAnsi="B Nazanin" w:cs="B Nazanin"/>
           <w:sz w:val="24"/>
           <w:szCs w:val="24"/>
+          <w:rtl/>
         </w:rPr>
         <w:t>جدول ۴-۷. نتایج تحلیل میانجی‌گری (الگوی شماره ۴، خودگردان‌سازی ۵۰۰۰ نمونه‌ای)</w:t>
       </w:r>
     </w:p>
     <w:p>
       <w:pPr>
+        <w:pStyle w:val="tableoffigures"/>
         <w:bidi/>
-        <w:jc w:val="both"/>
+        <w:jc w:val="right"/>
         <w:spacing w:line="580" w:lineRule="exact"/>
       </w:pPr>
       <w:r>
@@ -2022,14 +2187,16 @@
           <w:rFonts w:ascii="B Nazanin" w:hAnsi="B Nazanin" w:cs="B Nazanin"/>
           <w:sz w:val="24"/>
           <w:szCs w:val="24"/>
+          <w:rtl/>
         </w:rPr>
         <w:t>جدول ۴-۸. شاخص‌های مدل مقید میانجی‌گری کامل (مکمل، df=۱)</w:t>
       </w:r>
     </w:p>
     <w:p>
       <w:pPr>
+        <w:pStyle w:val="tableoffigures"/>
         <w:bidi/>
-        <w:jc w:val="both"/>
+        <w:jc w:val="right"/>
         <w:spacing w:line="580" w:lineRule="exact"/>
       </w:pPr>
       <w:r>
@@ -2037,6 +2204,7 @@
           <w:rFonts w:ascii="B Nazanin" w:hAnsi="B Nazanin" w:cs="B Nazanin"/>
           <w:sz w:val="24"/>
           <w:szCs w:val="24"/>
+          <w:rtl/>
         </w:rPr>
         <w:t>جدول ۴-۹. خلاصه نتایج آزمون فرضیه‌ها</w:t>
       </w:r>
@@ -2096,8 +2264,9 @@
     </w:p>
     <w:p>
       <w:pPr>
+        <w:pStyle w:val="tableoffigures"/>
         <w:bidi/>
-        <w:jc w:val="both"/>
+        <w:jc w:val="right"/>
         <w:spacing w:line="580" w:lineRule="exact"/>
       </w:pPr>
       <w:r>
@@ -2105,14 +2274,16 @@
           <w:rFonts w:ascii="B Nazanin" w:hAnsi="B Nazanin" w:cs="B Nazanin"/>
           <w:sz w:val="24"/>
           <w:szCs w:val="24"/>
+          <w:rtl/>
         </w:rPr>
         <w:t>شکل ۲-۱. مدل مفهومی پژوهش</w:t>
       </w:r>
     </w:p>
     <w:p>
       <w:pPr>
+        <w:pStyle w:val="tableoffigures"/>
         <w:bidi/>
-        <w:jc w:val="both"/>
+        <w:jc w:val="right"/>
         <w:spacing w:line="580" w:lineRule="exact"/>
       </w:pPr>
       <w:r>
@@ -2120,6 +2291,7 @@
           <w:rFonts w:ascii="B Nazanin" w:hAnsi="B Nazanin" w:cs="B Nazanin"/>
           <w:sz w:val="24"/>
           <w:szCs w:val="24"/>
+          <w:rtl/>
         </w:rPr>
         <w:t>شکل ۴-۱. نمودار مسیر الگوی میانجی‌گری با ضرایب برآوردشده در نمونه نهایی</w:t>
       </w:r>
@@ -26975,7 +27147,7 @@
 </file>
 
 <file path=word/styles.xml><?xml version="1.0" encoding="utf-8"?>
-<w:styles xmlns:mc="http://schemas.openxmlformats.org/markup-compatibility/2006" xmlns:r="http://schemas.openxmlformats.org/officeDocument/2006/relationships" xmlns:w="http://schemas.openxmlformats.org/wordprocessingml/2006/main" xmlns:w14="http://schemas.microsoft.com/office/word/2010/wordml" mc:Ignorable="w14">
+<w:styles xmlns:ns1="http://schemas.openxmlformats.org/markup-compatibility/2006" xmlns:w="http://schemas.openxmlformats.org/wordprocessingml/2006/main" ns1:Ignorable="w14">
   <w:docDefaults>
     <w:rPrDefault>
       <w:rPr>
@@ -38827,6 +38999,86 @@
       </w:tcPr>
     </w:tblStylePr>
   </w:style>
+  <w:style w:type="paragraph" w:styleId="TOC1">
+    <w:name w:val="toc 1"/>
+    <w:basedOn w:val="Normal"/>
+    <w:next w:val="Normal"/>
+    <w:semiHidden/>
+    <w:unhideWhenUsed/>
+    <w:pPr>
+      <w:tabs>
+        <w:tab w:val="left" w:leader="dot" w:pos="8221"/>
+      </w:tabs>
+      <w:jc w:val="right"/>
+      <w:bidi w:val="1"/>
+    </w:pPr>
+    <w:rPr>
+      <w:rFonts w:ascii="Times New Roman" w:hAnsi="Times New Roman" w:cs="B Nazanin"/>
+      <w:sz w:val="24"/>
+      <w:szCs w:val="24"/>
+      <w:rtl/>
+    </w:rPr>
+  </w:style>
+  <w:style w:type="paragraph" w:styleId="TOC2">
+    <w:name w:val="toc 2"/>
+    <w:basedOn w:val="Normal"/>
+    <w:next w:val="Normal"/>
+    <w:semiHidden/>
+    <w:unhideWhenUsed/>
+    <w:pPr>
+      <w:tabs>
+        <w:tab w:val="left" w:leader="dot" w:pos="8221"/>
+      </w:tabs>
+      <w:jc w:val="right"/>
+      <w:bidi w:val="1"/>
+    </w:pPr>
+    <w:rPr>
+      <w:rFonts w:ascii="Times New Roman" w:hAnsi="Times New Roman" w:cs="B Nazanin"/>
+      <w:sz w:val="22"/>
+      <w:szCs w:val="22"/>
+      <w:rtl/>
+    </w:rPr>
+  </w:style>
+  <w:style w:type="paragraph" w:styleId="TOC3">
+    <w:name w:val="toc 3"/>
+    <w:basedOn w:val="Normal"/>
+    <w:next w:val="Normal"/>
+    <w:semiHidden/>
+    <w:unhideWhenUsed/>
+    <w:pPr>
+      <w:tabs>
+        <w:tab w:val="left" w:leader="dot" w:pos="8221"/>
+      </w:tabs>
+      <w:jc w:val="right"/>
+      <w:bidi w:val="1"/>
+    </w:pPr>
+    <w:rPr>
+      <w:rFonts w:ascii="Times New Roman" w:hAnsi="Times New Roman" w:cs="B Nazanin"/>
+      <w:sz w:val="22"/>
+      <w:szCs w:val="22"/>
+      <w:rtl/>
+    </w:rPr>
+  </w:style>
+  <w:style w:type="paragraph" w:styleId="tableoffigures">
+    <w:name w:val="Table of Figures"/>
+    <w:basedOn w:val="Normal"/>
+    <w:next w:val="Normal"/>
+    <w:semiHidden/>
+    <w:unhideWhenUsed/>
+    <w:pPr>
+      <w:tabs>
+        <w:tab w:val="left" w:leader="dot" w:pos="8221"/>
+      </w:tabs>
+      <w:jc w:val="right"/>
+      <w:bidi w:val="1"/>
+    </w:pPr>
+    <w:rPr>
+      <w:rFonts w:ascii="Times New Roman" w:hAnsi="Times New Roman" w:cs="B Nazanin"/>
+      <w:sz w:val="24"/>
+      <w:szCs w:val="24"/>
+      <w:rtl/>
+    </w:rPr>
+  </w:style>
 </w:styles>
 </file>
 

</xml_diff>